<commit_message>
Add real product photo support (backend upload + storefront display)
- Product entity gets an Images field (comma-separated URLs)
- New admin endpoint for uploading photos to the backend's own storage
- Admin product editor: upload a photo or paste a URL, with previews
- Storefront (product cards, showcase gallery, flavor carousel) now
  shows real photos when available, falling back to the generated
  candy-color art otherwise
- Added real photos for 5 of 6 flavors (Strawberry Dream still uses
  generated art — no photo supplied yet)

Co-Authored-By: Claude Sonnet 5 <noreply@anthropic.com>
</commit_message>
<xml_diff>
--- a/Candy Station.docx
+++ b/Candy Station.docx
@@ -1633,11 +1633,1009 @@
       </w:r>
     </w:p>
     <w:p/>
+    <w:p>
+      <w:pPr>
+        <w:shd w:val="clear" w:color="auto" w:fill="FAFAFD"/>
+        <w:spacing w:before="24" w:after="48" w:line="240" w:lineRule="auto"/>
+        <w:rPr>
+          <w:rFonts w:ascii="Segoe UI" w:eastAsia="Times New Roman" w:hAnsi="Segoe UI" w:cs="Segoe UI"/>
+          <w:b/>
+          <w:bCs/>
+          <w:color w:val="202020"/>
+          <w:sz w:val="24"/>
+          <w:szCs w:val="24"/>
+          <w:lang w:bidi="ne-NP"/>
+        </w:rPr>
+      </w:pPr>
+      <w:r>
+        <w:rPr>
+          <w:rFonts w:ascii="Segoe UI" w:eastAsia="Times New Roman" w:hAnsi="Segoe UI" w:cs="Segoe UI"/>
+          <w:b/>
+          <w:bCs/>
+          <w:color w:val="202020"/>
+          <w:sz w:val="24"/>
+          <w:szCs w:val="24"/>
+          <w:lang w:bidi="ne-NP"/>
+        </w:rPr>
+        <w:t>Fixed today:</w:t>
+      </w:r>
+    </w:p>
+    <w:p>
+      <w:pPr>
+        <w:shd w:val="clear" w:color="auto" w:fill="FAFAFD"/>
+        <w:spacing w:before="24" w:after="48" w:line="240" w:lineRule="auto"/>
+        <w:rPr>
+          <w:rFonts w:ascii="Segoe UI" w:eastAsia="Times New Roman" w:hAnsi="Segoe UI" w:cs="Segoe UI"/>
+          <w:color w:val="202020"/>
+          <w:sz w:val="20"/>
+          <w:szCs w:val="20"/>
+          <w:lang w:bidi="ne-NP"/>
+        </w:rPr>
+      </w:pPr>
+    </w:p>
+    <w:p>
+      <w:pPr>
+        <w:shd w:val="clear" w:color="auto" w:fill="FAFAFD"/>
+        <w:spacing w:before="24" w:after="48" w:line="240" w:lineRule="auto"/>
+        <w:rPr>
+          <w:rFonts w:ascii="Courier New" w:eastAsia="Times New Roman" w:hAnsi="Courier New" w:cs="Courier New"/>
+          <w:color w:val="606060"/>
+          <w:sz w:val="18"/>
+          <w:szCs w:val="18"/>
+          <w:shd w:val="clear" w:color="auto" w:fill="ECECEC"/>
+          <w:lang w:bidi="ne-NP"/>
+        </w:rPr>
+      </w:pPr>
+      <w:hyperlink r:id="rId14" w:history="1">
+        <w:r>
+          <w:rPr>
+            <w:rStyle w:val="Hyperlink"/>
+            <w:rFonts w:ascii="Segoe UI" w:eastAsia="Times New Roman" w:hAnsi="Segoe UI" w:cs="Segoe UI"/>
+            <w:sz w:val="20"/>
+            <w:szCs w:val="20"/>
+            <w:lang w:bidi="ne-NP"/>
+          </w:rPr>
+          <w:t>https://candystation.com.np/</w:t>
+        </w:r>
+        <w:r>
+          <w:rPr>
+            <w:rStyle w:val="Hyperlink"/>
+            <w:rFonts w:ascii="Courier New" w:eastAsia="Times New Roman" w:hAnsi="Courier New" w:cs="Courier New"/>
+            <w:sz w:val="18"/>
+            <w:szCs w:val="18"/>
+            <w:shd w:val="clear" w:color="auto" w:fill="ECECEC"/>
+            <w:lang w:bidi="ne-NP"/>
+          </w:rPr>
+          <w:t>admin/login</w:t>
+        </w:r>
+      </w:hyperlink>
+    </w:p>
+    <w:p>
+      <w:pPr>
+        <w:shd w:val="clear" w:color="auto" w:fill="FAFAFD"/>
+        <w:spacing w:before="24" w:after="48" w:line="240" w:lineRule="auto"/>
+        <w:rPr>
+          <w:rFonts w:ascii="Segoe UI" w:eastAsia="Times New Roman" w:hAnsi="Segoe UI" w:cs="Segoe UI"/>
+          <w:color w:val="202020"/>
+          <w:sz w:val="20"/>
+          <w:szCs w:val="20"/>
+          <w:lang w:bidi="ne-NP"/>
+        </w:rPr>
+      </w:pPr>
+      <w:proofErr w:type="gramStart"/>
+      <w:r>
+        <w:rPr>
+          <w:rFonts w:ascii="Segoe UI" w:eastAsia="Times New Roman" w:hAnsi="Segoe UI" w:cs="Segoe UI"/>
+          <w:color w:val="202020"/>
+          <w:sz w:val="20"/>
+          <w:szCs w:val="20"/>
+          <w:lang w:bidi="ne-NP"/>
+        </w:rPr>
+        <w:t>Username :</w:t>
+      </w:r>
+      <w:proofErr w:type="gramEnd"/>
+      <w:r>
+        <w:rPr>
+          <w:rFonts w:ascii="Segoe UI" w:eastAsia="Times New Roman" w:hAnsi="Segoe UI" w:cs="Segoe UI"/>
+          <w:color w:val="202020"/>
+          <w:sz w:val="20"/>
+          <w:szCs w:val="20"/>
+          <w:lang w:bidi="ne-NP"/>
+        </w:rPr>
+        <w:t xml:space="preserve"> </w:t>
+      </w:r>
+      <w:hyperlink r:id="rId15" w:history="1">
+        <w:r>
+          <w:rPr>
+            <w:rStyle w:val="Hyperlink"/>
+            <w:rFonts w:ascii="Segoe UI" w:eastAsia="Times New Roman" w:hAnsi="Segoe UI" w:cs="Segoe UI"/>
+            <w:sz w:val="20"/>
+            <w:szCs w:val="20"/>
+            <w:lang w:bidi="ne-NP"/>
+          </w:rPr>
+          <w:t>Rubalbasnet06@gmail.com</w:t>
+        </w:r>
+      </w:hyperlink>
+    </w:p>
+    <w:p>
+      <w:pPr>
+        <w:shd w:val="clear" w:color="auto" w:fill="FAFAFD"/>
+        <w:spacing w:before="24" w:after="48" w:line="240" w:lineRule="auto"/>
+        <w:rPr>
+          <w:rFonts w:ascii="Segoe UI" w:eastAsia="Times New Roman" w:hAnsi="Segoe UI" w:cs="Segoe UI"/>
+          <w:color w:val="202020"/>
+          <w:sz w:val="20"/>
+          <w:szCs w:val="20"/>
+          <w:lang w:bidi="ne-NP"/>
+        </w:rPr>
+      </w:pPr>
+      <w:r>
+        <w:rPr>
+          <w:rFonts w:ascii="Segoe UI" w:eastAsia="Times New Roman" w:hAnsi="Segoe UI" w:cs="Segoe UI"/>
+          <w:color w:val="202020"/>
+          <w:sz w:val="20"/>
+          <w:szCs w:val="20"/>
+          <w:lang w:bidi="ne-NP"/>
+        </w:rPr>
+        <w:t xml:space="preserve">Password: </w:t>
+      </w:r>
+      <w:r>
+        <w:rPr>
+          <w:rFonts w:ascii="Segoe UI" w:eastAsia="Times New Roman" w:hAnsi="Segoe UI" w:cs="Segoe UI"/>
+          <w:color w:val="202020"/>
+          <w:sz w:val="20"/>
+          <w:szCs w:val="20"/>
+          <w:lang w:bidi="ne-NP"/>
+        </w:rPr>
+        <w:t>CandyStation#Rubal2026!</w:t>
+      </w:r>
+    </w:p>
+    <w:p>
+      <w:pPr>
+        <w:shd w:val="clear" w:color="auto" w:fill="FAFAFD"/>
+        <w:spacing w:before="24" w:after="48" w:line="240" w:lineRule="auto"/>
+        <w:rPr>
+          <w:rFonts w:ascii="Segoe UI" w:eastAsia="Times New Roman" w:hAnsi="Segoe UI" w:cs="Segoe UI"/>
+          <w:color w:val="202020"/>
+          <w:sz w:val="20"/>
+          <w:szCs w:val="20"/>
+          <w:lang w:bidi="ne-NP"/>
+        </w:rPr>
+      </w:pPr>
+      <w:proofErr w:type="gramStart"/>
+      <w:r>
+        <w:rPr>
+          <w:rFonts w:ascii="Segoe UI" w:eastAsia="Times New Roman" w:hAnsi="Segoe UI" w:cs="Segoe UI"/>
+          <w:color w:val="202020"/>
+          <w:sz w:val="20"/>
+          <w:szCs w:val="20"/>
+          <w:lang w:bidi="ne-NP"/>
+        </w:rPr>
+        <w:t>Username :</w:t>
+      </w:r>
+      <w:proofErr w:type="gramEnd"/>
+      <w:r>
+        <w:rPr>
+          <w:rFonts w:ascii="Segoe UI" w:eastAsia="Times New Roman" w:hAnsi="Segoe UI" w:cs="Segoe UI"/>
+          <w:color w:val="202020"/>
+          <w:sz w:val="20"/>
+          <w:szCs w:val="20"/>
+          <w:lang w:bidi="ne-NP"/>
+        </w:rPr>
+        <w:t xml:space="preserve"> </w:t>
+      </w:r>
+      <w:r>
+        <w:rPr>
+          <w:rFonts w:ascii="Segoe UI" w:eastAsia="Times New Roman" w:hAnsi="Segoe UI" w:cs="Segoe UI"/>
+          <w:color w:val="202020"/>
+          <w:sz w:val="20"/>
+          <w:szCs w:val="20"/>
+          <w:lang w:bidi="ne-NP"/>
+        </w:rPr>
+        <w:t>rider1</w:t>
+      </w:r>
+    </w:p>
+    <w:p>
+      <w:pPr>
+        <w:shd w:val="clear" w:color="auto" w:fill="FAFAFD"/>
+        <w:spacing w:before="24" w:after="48" w:line="240" w:lineRule="auto"/>
+        <w:rPr>
+          <w:rFonts w:ascii="Segoe UI" w:eastAsia="Times New Roman" w:hAnsi="Segoe UI" w:cs="Segoe UI"/>
+          <w:color w:val="202020"/>
+          <w:sz w:val="20"/>
+          <w:szCs w:val="20"/>
+          <w:lang w:bidi="ne-NP"/>
+        </w:rPr>
+      </w:pPr>
+      <w:proofErr w:type="gramStart"/>
+      <w:r>
+        <w:rPr>
+          <w:rFonts w:ascii="Segoe UI" w:eastAsia="Times New Roman" w:hAnsi="Segoe UI" w:cs="Segoe UI"/>
+          <w:color w:val="202020"/>
+          <w:sz w:val="20"/>
+          <w:szCs w:val="20"/>
+          <w:lang w:bidi="ne-NP"/>
+        </w:rPr>
+        <w:t>Password :</w:t>
+      </w:r>
+      <w:proofErr w:type="gramEnd"/>
+      <w:r>
+        <w:rPr>
+          <w:rFonts w:ascii="Segoe UI" w:eastAsia="Times New Roman" w:hAnsi="Segoe UI" w:cs="Segoe UI"/>
+          <w:color w:val="202020"/>
+          <w:sz w:val="20"/>
+          <w:szCs w:val="20"/>
+          <w:lang w:bidi="ne-NP"/>
+        </w:rPr>
+        <w:t xml:space="preserve"> </w:t>
+      </w:r>
+      <w:r>
+        <w:rPr>
+          <w:rFonts w:ascii="Segoe UI" w:eastAsia="Times New Roman" w:hAnsi="Segoe UI" w:cs="Segoe UI"/>
+          <w:color w:val="202020"/>
+          <w:sz w:val="20"/>
+          <w:szCs w:val="20"/>
+          <w:lang w:bidi="ne-NP"/>
+        </w:rPr>
+        <w:t>CandyStation#Rider2026!)</w:t>
+      </w:r>
+    </w:p>
+    <w:p>
+      <w:pPr>
+        <w:shd w:val="clear" w:color="auto" w:fill="FAFAFD"/>
+        <w:spacing w:before="24" w:after="48" w:line="240" w:lineRule="auto"/>
+        <w:rPr>
+          <w:rFonts w:ascii="Segoe UI" w:eastAsia="Times New Roman" w:hAnsi="Segoe UI" w:cs="Segoe UI"/>
+          <w:color w:val="202020"/>
+          <w:sz w:val="20"/>
+          <w:szCs w:val="20"/>
+          <w:lang w:bidi="ne-NP"/>
+        </w:rPr>
+      </w:pPr>
+      <w:bookmarkStart w:id="0" w:name="_GoBack"/>
+      <w:bookmarkEnd w:id="0"/>
+    </w:p>
+    <w:p>
+      <w:pPr>
+        <w:shd w:val="clear" w:color="auto" w:fill="FAFAFD"/>
+        <w:spacing w:before="24" w:after="48" w:line="240" w:lineRule="auto"/>
+        <w:rPr>
+          <w:rFonts w:ascii="Segoe UI" w:eastAsia="Times New Roman" w:hAnsi="Segoe UI" w:cs="Segoe UI"/>
+          <w:color w:val="202020"/>
+          <w:sz w:val="20"/>
+          <w:szCs w:val="20"/>
+          <w:lang w:bidi="ne-NP"/>
+        </w:rPr>
+      </w:pPr>
+    </w:p>
+    <w:p>
+      <w:pPr>
+        <w:numPr>
+          <w:ilvl w:val="0"/>
+          <w:numId w:val="2"/>
+        </w:numPr>
+        <w:shd w:val="clear" w:color="auto" w:fill="FAFAFD"/>
+        <w:spacing w:before="100" w:beforeAutospacing="1" w:after="100" w:afterAutospacing="1" w:line="240" w:lineRule="auto"/>
+        <w:rPr>
+          <w:rFonts w:ascii="Segoe UI" w:eastAsia="Times New Roman" w:hAnsi="Segoe UI" w:cs="Segoe UI"/>
+          <w:color w:val="202020"/>
+          <w:sz w:val="20"/>
+          <w:szCs w:val="20"/>
+          <w:lang w:bidi="ne-NP"/>
+        </w:rPr>
+      </w:pPr>
+      <w:r>
+        <w:rPr>
+          <w:rFonts w:ascii="Segoe UI" w:eastAsia="Times New Roman" w:hAnsi="Segoe UI" w:cs="Segoe UI"/>
+          <w:b/>
+          <w:bCs/>
+          <w:color w:val="202020"/>
+          <w:sz w:val="24"/>
+          <w:szCs w:val="24"/>
+          <w:lang w:bidi="ne-NP"/>
+        </w:rPr>
+        <w:t>Demo credentials removed</w:t>
+      </w:r>
+      <w:r>
+        <w:rPr>
+          <w:rFonts w:ascii="Segoe UI" w:eastAsia="Times New Roman" w:hAnsi="Segoe UI" w:cs="Segoe UI"/>
+          <w:color w:val="202020"/>
+          <w:sz w:val="20"/>
+          <w:szCs w:val="20"/>
+          <w:lang w:bidi="ne-NP"/>
+        </w:rPr>
+        <w:t> from both login pages (customer </w:t>
+      </w:r>
+      <w:r>
+        <w:rPr>
+          <w:rFonts w:ascii="Courier New" w:eastAsia="Times New Roman" w:hAnsi="Courier New" w:cs="Courier New"/>
+          <w:color w:val="606060"/>
+          <w:sz w:val="18"/>
+          <w:szCs w:val="18"/>
+          <w:shd w:val="clear" w:color="auto" w:fill="ECECEC"/>
+          <w:lang w:bidi="ne-NP"/>
+        </w:rPr>
+        <w:t>/login</w:t>
+      </w:r>
+      <w:r>
+        <w:rPr>
+          <w:rFonts w:ascii="Segoe UI" w:eastAsia="Times New Roman" w:hAnsi="Segoe UI" w:cs="Segoe UI"/>
+          <w:color w:val="202020"/>
+          <w:sz w:val="20"/>
+          <w:szCs w:val="20"/>
+          <w:lang w:bidi="ne-NP"/>
+        </w:rPr>
+        <w:t> and </w:t>
+      </w:r>
+      <w:r>
+        <w:rPr>
+          <w:rFonts w:ascii="Courier New" w:eastAsia="Times New Roman" w:hAnsi="Courier New" w:cs="Courier New"/>
+          <w:color w:val="606060"/>
+          <w:sz w:val="18"/>
+          <w:szCs w:val="18"/>
+          <w:shd w:val="clear" w:color="auto" w:fill="ECECEC"/>
+          <w:lang w:bidi="ne-NP"/>
+        </w:rPr>
+        <w:t>/admin/login</w:t>
+      </w:r>
+      <w:r>
+        <w:rPr>
+          <w:rFonts w:ascii="Segoe UI" w:eastAsia="Times New Roman" w:hAnsi="Segoe UI" w:cs="Segoe UI"/>
+          <w:color w:val="202020"/>
+          <w:sz w:val="20"/>
+          <w:szCs w:val="20"/>
+          <w:lang w:bidi="ne-NP"/>
+        </w:rPr>
+        <w:t>)</w:t>
+      </w:r>
+    </w:p>
+    <w:p>
+      <w:pPr>
+        <w:numPr>
+          <w:ilvl w:val="0"/>
+          <w:numId w:val="2"/>
+        </w:numPr>
+        <w:shd w:val="clear" w:color="auto" w:fill="FAFAFD"/>
+        <w:spacing w:before="100" w:beforeAutospacing="1" w:after="100" w:afterAutospacing="1" w:line="240" w:lineRule="auto"/>
+        <w:rPr>
+          <w:rFonts w:ascii="Segoe UI" w:eastAsia="Times New Roman" w:hAnsi="Segoe UI" w:cs="Segoe UI"/>
+          <w:color w:val="202020"/>
+          <w:sz w:val="20"/>
+          <w:szCs w:val="20"/>
+          <w:lang w:bidi="ne-NP"/>
+        </w:rPr>
+      </w:pPr>
+      <w:r>
+        <w:rPr>
+          <w:rFonts w:ascii="Segoe UI" w:eastAsia="Times New Roman" w:hAnsi="Segoe UI" w:cs="Segoe UI"/>
+          <w:b/>
+          <w:bCs/>
+          <w:color w:val="202020"/>
+          <w:sz w:val="24"/>
+          <w:szCs w:val="24"/>
+          <w:lang w:bidi="ne-NP"/>
+        </w:rPr>
+        <w:t>Real admin account created</w:t>
+      </w:r>
+      <w:r>
+        <w:rPr>
+          <w:rFonts w:ascii="Segoe UI" w:eastAsia="Times New Roman" w:hAnsi="Segoe UI" w:cs="Segoe UI"/>
+          <w:color w:val="202020"/>
+          <w:sz w:val="20"/>
+          <w:szCs w:val="20"/>
+          <w:lang w:bidi="ne-NP"/>
+        </w:rPr>
+        <w:t>: </w:t>
+      </w:r>
+      <w:r>
+        <w:rPr>
+          <w:rFonts w:ascii="Courier New" w:eastAsia="Times New Roman" w:hAnsi="Courier New" w:cs="Courier New"/>
+          <w:color w:val="606060"/>
+          <w:sz w:val="18"/>
+          <w:szCs w:val="18"/>
+          <w:shd w:val="clear" w:color="auto" w:fill="ECECEC"/>
+          <w:lang w:bidi="ne-NP"/>
+        </w:rPr>
+        <w:t>Rubalbasnet06@gmail.com</w:t>
+      </w:r>
+      <w:r>
+        <w:rPr>
+          <w:rFonts w:ascii="Segoe UI" w:eastAsia="Times New Roman" w:hAnsi="Segoe UI" w:cs="Segoe UI"/>
+          <w:color w:val="202020"/>
+          <w:sz w:val="20"/>
+          <w:szCs w:val="20"/>
+          <w:lang w:bidi="ne-NP"/>
+        </w:rPr>
+        <w:t> / </w:t>
+      </w:r>
+      <w:r>
+        <w:rPr>
+          <w:rFonts w:ascii="Courier New" w:eastAsia="Times New Roman" w:hAnsi="Courier New" w:cs="Courier New"/>
+          <w:color w:val="606060"/>
+          <w:sz w:val="18"/>
+          <w:szCs w:val="18"/>
+          <w:shd w:val="clear" w:color="auto" w:fill="ECECEC"/>
+          <w:lang w:bidi="ne-NP"/>
+        </w:rPr>
+        <w:t>CandyStation#Rubal2026!</w:t>
+      </w:r>
+      <w:r>
+        <w:rPr>
+          <w:rFonts w:ascii="Segoe UI" w:eastAsia="Times New Roman" w:hAnsi="Segoe UI" w:cs="Segoe UI"/>
+          <w:color w:val="202020"/>
+          <w:sz w:val="20"/>
+          <w:szCs w:val="20"/>
+          <w:lang w:bidi="ne-NP"/>
+        </w:rPr>
+        <w:t> — old </w:t>
+      </w:r>
+      <w:r>
+        <w:rPr>
+          <w:rFonts w:ascii="Courier New" w:eastAsia="Times New Roman" w:hAnsi="Courier New" w:cs="Courier New"/>
+          <w:color w:val="606060"/>
+          <w:sz w:val="18"/>
+          <w:szCs w:val="18"/>
+          <w:shd w:val="clear" w:color="auto" w:fill="ECECEC"/>
+          <w:lang w:bidi="ne-NP"/>
+        </w:rPr>
+        <w:t>admin</w:t>
+      </w:r>
+      <w:r>
+        <w:rPr>
+          <w:rFonts w:ascii="Segoe UI" w:eastAsia="Times New Roman" w:hAnsi="Segoe UI" w:cs="Segoe UI"/>
+          <w:color w:val="202020"/>
+          <w:sz w:val="20"/>
+          <w:szCs w:val="20"/>
+          <w:lang w:bidi="ne-NP"/>
+        </w:rPr>
+        <w:t>/</w:t>
+      </w:r>
+      <w:r>
+        <w:rPr>
+          <w:rFonts w:ascii="Courier New" w:eastAsia="Times New Roman" w:hAnsi="Courier New" w:cs="Courier New"/>
+          <w:color w:val="606060"/>
+          <w:sz w:val="18"/>
+          <w:szCs w:val="18"/>
+          <w:shd w:val="clear" w:color="auto" w:fill="ECECEC"/>
+          <w:lang w:bidi="ne-NP"/>
+        </w:rPr>
+        <w:t>admin123</w:t>
+      </w:r>
+      <w:r>
+        <w:rPr>
+          <w:rFonts w:ascii="Segoe UI" w:eastAsia="Times New Roman" w:hAnsi="Segoe UI" w:cs="Segoe UI"/>
+          <w:color w:val="202020"/>
+          <w:sz w:val="20"/>
+          <w:szCs w:val="20"/>
+          <w:lang w:bidi="ne-NP"/>
+        </w:rPr>
+        <w:t> account deleted and confirmed dead (401)</w:t>
+      </w:r>
+    </w:p>
+    <w:p>
+      <w:pPr>
+        <w:numPr>
+          <w:ilvl w:val="0"/>
+          <w:numId w:val="2"/>
+        </w:numPr>
+        <w:shd w:val="clear" w:color="auto" w:fill="FAFAFD"/>
+        <w:spacing w:before="100" w:beforeAutospacing="1" w:after="100" w:afterAutospacing="1" w:line="240" w:lineRule="auto"/>
+        <w:rPr>
+          <w:rFonts w:ascii="Segoe UI" w:eastAsia="Times New Roman" w:hAnsi="Segoe UI" w:cs="Segoe UI"/>
+          <w:color w:val="202020"/>
+          <w:sz w:val="20"/>
+          <w:szCs w:val="20"/>
+          <w:lang w:bidi="ne-NP"/>
+        </w:rPr>
+      </w:pPr>
+      <w:r>
+        <w:rPr>
+          <w:rFonts w:ascii="Segoe UI" w:eastAsia="Times New Roman" w:hAnsi="Segoe UI" w:cs="Segoe UI"/>
+          <w:b/>
+          <w:bCs/>
+          <w:color w:val="202020"/>
+          <w:sz w:val="24"/>
+          <w:szCs w:val="24"/>
+          <w:lang w:bidi="ne-NP"/>
+        </w:rPr>
+        <w:t>Stronger passwords</w:t>
+      </w:r>
+      <w:r>
+        <w:rPr>
+          <w:rFonts w:ascii="Segoe UI" w:eastAsia="Times New Roman" w:hAnsi="Segoe UI" w:cs="Segoe UI"/>
+          <w:color w:val="202020"/>
+          <w:sz w:val="20"/>
+          <w:szCs w:val="20"/>
+          <w:lang w:bidi="ne-NP"/>
+        </w:rPr>
+        <w:t> set for rider (</w:t>
+      </w:r>
+      <w:r>
+        <w:rPr>
+          <w:rFonts w:ascii="Courier New" w:eastAsia="Times New Roman" w:hAnsi="Courier New" w:cs="Courier New"/>
+          <w:color w:val="606060"/>
+          <w:sz w:val="18"/>
+          <w:szCs w:val="18"/>
+          <w:shd w:val="clear" w:color="auto" w:fill="ECECEC"/>
+          <w:lang w:bidi="ne-NP"/>
+        </w:rPr>
+        <w:t>rider1</w:t>
+      </w:r>
+      <w:r>
+        <w:rPr>
+          <w:rFonts w:ascii="Segoe UI" w:eastAsia="Times New Roman" w:hAnsi="Segoe UI" w:cs="Segoe UI"/>
+          <w:color w:val="202020"/>
+          <w:sz w:val="20"/>
+          <w:szCs w:val="20"/>
+          <w:lang w:bidi="ne-NP"/>
+        </w:rPr>
+        <w:t> / </w:t>
+      </w:r>
+      <w:r>
+        <w:rPr>
+          <w:rFonts w:ascii="Courier New" w:eastAsia="Times New Roman" w:hAnsi="Courier New" w:cs="Courier New"/>
+          <w:color w:val="606060"/>
+          <w:sz w:val="18"/>
+          <w:szCs w:val="18"/>
+          <w:shd w:val="clear" w:color="auto" w:fill="ECECEC"/>
+          <w:lang w:bidi="ne-NP"/>
+        </w:rPr>
+        <w:t>CandyStation#Rider2026!</w:t>
+      </w:r>
+      <w:r>
+        <w:rPr>
+          <w:rFonts w:ascii="Segoe UI" w:eastAsia="Times New Roman" w:hAnsi="Segoe UI" w:cs="Segoe UI"/>
+          <w:color w:val="202020"/>
+          <w:sz w:val="20"/>
+          <w:szCs w:val="20"/>
+          <w:lang w:bidi="ne-NP"/>
+        </w:rPr>
+        <w:t>) and demo customer account</w:t>
+      </w:r>
+    </w:p>
+    <w:p>
+      <w:pPr>
+        <w:numPr>
+          <w:ilvl w:val="0"/>
+          <w:numId w:val="2"/>
+        </w:numPr>
+        <w:shd w:val="clear" w:color="auto" w:fill="FAFAFD"/>
+        <w:spacing w:before="100" w:beforeAutospacing="1" w:after="100" w:afterAutospacing="1" w:line="240" w:lineRule="auto"/>
+        <w:rPr>
+          <w:rFonts w:ascii="Segoe UI" w:eastAsia="Times New Roman" w:hAnsi="Segoe UI" w:cs="Segoe UI"/>
+          <w:color w:val="202020"/>
+          <w:sz w:val="20"/>
+          <w:szCs w:val="20"/>
+          <w:lang w:bidi="ne-NP"/>
+        </w:rPr>
+      </w:pPr>
+      <w:r>
+        <w:rPr>
+          <w:rFonts w:ascii="Segoe UI" w:eastAsia="Times New Roman" w:hAnsi="Segoe UI" w:cs="Segoe UI"/>
+          <w:b/>
+          <w:bCs/>
+          <w:color w:val="202020"/>
+          <w:sz w:val="24"/>
+          <w:szCs w:val="24"/>
+          <w:lang w:bidi="ne-NP"/>
+        </w:rPr>
+        <w:t>Navbar "Login" bug fixed</w:t>
+      </w:r>
+      <w:r>
+        <w:rPr>
+          <w:rFonts w:ascii="Segoe UI" w:eastAsia="Times New Roman" w:hAnsi="Segoe UI" w:cs="Segoe UI"/>
+          <w:color w:val="202020"/>
+          <w:sz w:val="20"/>
+          <w:szCs w:val="20"/>
+          <w:lang w:bidi="ne-NP"/>
+        </w:rPr>
+        <w:t> — it never actually checked login state before; now shows a Profile link with your name when logged in</w:t>
+      </w:r>
+    </w:p>
+    <w:p>
+      <w:pPr>
+        <w:numPr>
+          <w:ilvl w:val="0"/>
+          <w:numId w:val="2"/>
+        </w:numPr>
+        <w:shd w:val="clear" w:color="auto" w:fill="FAFAFD"/>
+        <w:spacing w:before="100" w:beforeAutospacing="1" w:after="100" w:afterAutospacing="1" w:line="240" w:lineRule="auto"/>
+        <w:rPr>
+          <w:rFonts w:ascii="Segoe UI" w:eastAsia="Times New Roman" w:hAnsi="Segoe UI" w:cs="Segoe UI"/>
+          <w:color w:val="202020"/>
+          <w:sz w:val="20"/>
+          <w:szCs w:val="20"/>
+          <w:lang w:bidi="ne-NP"/>
+        </w:rPr>
+      </w:pPr>
+      <w:r>
+        <w:rPr>
+          <w:rFonts w:ascii="Segoe UI" w:eastAsia="Times New Roman" w:hAnsi="Segoe UI" w:cs="Segoe UI"/>
+          <w:b/>
+          <w:bCs/>
+          <w:color w:val="202020"/>
+          <w:sz w:val="24"/>
+          <w:szCs w:val="24"/>
+          <w:lang w:bidi="ne-NP"/>
+        </w:rPr>
+        <w:t>Root cause of missing emails found</w:t>
+      </w:r>
+      <w:r>
+        <w:rPr>
+          <w:rFonts w:ascii="Segoe UI" w:eastAsia="Times New Roman" w:hAnsi="Segoe UI" w:cs="Segoe UI"/>
+          <w:color w:val="202020"/>
+          <w:sz w:val="20"/>
+          <w:szCs w:val="20"/>
+          <w:lang w:bidi="ne-NP"/>
+        </w:rPr>
+        <w:t xml:space="preserve">: </w:t>
+      </w:r>
+      <w:proofErr w:type="spellStart"/>
+      <w:r>
+        <w:rPr>
+          <w:rFonts w:ascii="Segoe UI" w:eastAsia="Times New Roman" w:hAnsi="Segoe UI" w:cs="Segoe UI"/>
+          <w:color w:val="202020"/>
+          <w:sz w:val="20"/>
+          <w:szCs w:val="20"/>
+          <w:lang w:bidi="ne-NP"/>
+        </w:rPr>
+        <w:t>Brevo's</w:t>
+      </w:r>
+      <w:proofErr w:type="spellEnd"/>
+      <w:r>
+        <w:rPr>
+          <w:rFonts w:ascii="Segoe UI" w:eastAsia="Times New Roman" w:hAnsi="Segoe UI" w:cs="Segoe UI"/>
+          <w:color w:val="202020"/>
+          <w:sz w:val="20"/>
+          <w:szCs w:val="20"/>
+          <w:lang w:bidi="ne-NP"/>
+        </w:rPr>
+        <w:t xml:space="preserve"> SMTP key had been rotated/deactivated (</w:t>
+      </w:r>
+      <w:r>
+        <w:rPr>
+          <w:rFonts w:ascii="Courier New" w:eastAsia="Times New Roman" w:hAnsi="Courier New" w:cs="Courier New"/>
+          <w:color w:val="606060"/>
+          <w:sz w:val="18"/>
+          <w:szCs w:val="18"/>
+          <w:shd w:val="clear" w:color="auto" w:fill="ECECEC"/>
+          <w:lang w:bidi="ne-NP"/>
+        </w:rPr>
+        <w:t>535 Authentication failed</w:t>
+      </w:r>
+      <w:r>
+        <w:rPr>
+          <w:rFonts w:ascii="Segoe UI" w:eastAsia="Times New Roman" w:hAnsi="Segoe UI" w:cs="Segoe UI"/>
+          <w:color w:val="202020"/>
+          <w:sz w:val="20"/>
+          <w:szCs w:val="20"/>
+          <w:lang w:bidi="ne-NP"/>
+        </w:rPr>
+        <w:t>) — updated to your new key and confirmed clean sends</w:t>
+      </w:r>
+    </w:p>
+    <w:p>
+      <w:pPr>
+        <w:numPr>
+          <w:ilvl w:val="0"/>
+          <w:numId w:val="2"/>
+        </w:numPr>
+        <w:shd w:val="clear" w:color="auto" w:fill="FAFAFD"/>
+        <w:spacing w:before="100" w:beforeAutospacing="1" w:after="100" w:afterAutospacing="1" w:line="240" w:lineRule="auto"/>
+        <w:rPr>
+          <w:rFonts w:ascii="Segoe UI" w:eastAsia="Times New Roman" w:hAnsi="Segoe UI" w:cs="Segoe UI"/>
+          <w:color w:val="202020"/>
+          <w:sz w:val="20"/>
+          <w:szCs w:val="20"/>
+          <w:lang w:bidi="ne-NP"/>
+        </w:rPr>
+      </w:pPr>
+      <w:r>
+        <w:rPr>
+          <w:rFonts w:ascii="Segoe UI" w:eastAsia="Times New Roman" w:hAnsi="Segoe UI" w:cs="Segoe UI"/>
+          <w:b/>
+          <w:bCs/>
+          <w:color w:val="202020"/>
+          <w:sz w:val="24"/>
+          <w:szCs w:val="24"/>
+          <w:lang w:bidi="ne-NP"/>
+        </w:rPr>
+        <w:lastRenderedPageBreak/>
+        <w:t>Email volume reduced</w:t>
+      </w:r>
+      <w:r>
+        <w:rPr>
+          <w:rFonts w:ascii="Segoe UI" w:eastAsia="Times New Roman" w:hAnsi="Segoe UI" w:cs="Segoe UI"/>
+          <w:color w:val="202020"/>
+          <w:sz w:val="20"/>
+          <w:szCs w:val="20"/>
+          <w:lang w:bidi="ne-NP"/>
+        </w:rPr>
+        <w:t> per your request — now only fires on order placement and delivery, not every intermediate status</w:t>
+      </w:r>
+    </w:p>
+    <w:p>
+      <w:pPr>
+        <w:numPr>
+          <w:ilvl w:val="0"/>
+          <w:numId w:val="2"/>
+        </w:numPr>
+        <w:shd w:val="clear" w:color="auto" w:fill="FAFAFD"/>
+        <w:spacing w:before="100" w:beforeAutospacing="1" w:after="100" w:afterAutospacing="1" w:line="240" w:lineRule="auto"/>
+        <w:rPr>
+          <w:rFonts w:ascii="Segoe UI" w:eastAsia="Times New Roman" w:hAnsi="Segoe UI" w:cs="Segoe UI"/>
+          <w:color w:val="202020"/>
+          <w:sz w:val="20"/>
+          <w:szCs w:val="20"/>
+          <w:lang w:bidi="ne-NP"/>
+        </w:rPr>
+      </w:pPr>
+      <w:r>
+        <w:rPr>
+          <w:rFonts w:ascii="Segoe UI" w:eastAsia="Times New Roman" w:hAnsi="Segoe UI" w:cs="Segoe UI"/>
+          <w:b/>
+          <w:bCs/>
+          <w:color w:val="202020"/>
+          <w:sz w:val="24"/>
+          <w:szCs w:val="24"/>
+          <w:lang w:bidi="ne-NP"/>
+        </w:rPr>
+        <w:t>Admin now gets notified too</w:t>
+      </w:r>
+      <w:r>
+        <w:rPr>
+          <w:rFonts w:ascii="Segoe UI" w:eastAsia="Times New Roman" w:hAnsi="Segoe UI" w:cs="Segoe UI"/>
+          <w:color w:val="202020"/>
+          <w:sz w:val="20"/>
+          <w:szCs w:val="20"/>
+          <w:lang w:bidi="ne-NP"/>
+        </w:rPr>
+        <w:t> — new order alert + delivery confirmation, sent to </w:t>
+      </w:r>
+      <w:r>
+        <w:rPr>
+          <w:rFonts w:ascii="Courier New" w:eastAsia="Times New Roman" w:hAnsi="Courier New" w:cs="Courier New"/>
+          <w:color w:val="606060"/>
+          <w:sz w:val="18"/>
+          <w:szCs w:val="18"/>
+          <w:shd w:val="clear" w:color="auto" w:fill="ECECEC"/>
+          <w:lang w:bidi="ne-NP"/>
+        </w:rPr>
+        <w:t>Rubalbasnet06@gmail.com</w:t>
+      </w:r>
+    </w:p>
+    <w:p>
+      <w:pPr>
+        <w:shd w:val="clear" w:color="auto" w:fill="FAFAFD"/>
+        <w:spacing w:before="24" w:after="48" w:line="240" w:lineRule="auto"/>
+        <w:rPr>
+          <w:rFonts w:ascii="Segoe UI" w:eastAsia="Times New Roman" w:hAnsi="Segoe UI" w:cs="Segoe UI"/>
+          <w:color w:val="202020"/>
+          <w:sz w:val="20"/>
+          <w:szCs w:val="20"/>
+          <w:lang w:bidi="ne-NP"/>
+        </w:rPr>
+      </w:pPr>
+      <w:r>
+        <w:rPr>
+          <w:rFonts w:ascii="Segoe UI" w:eastAsia="Times New Roman" w:hAnsi="Segoe UI" w:cs="Segoe UI"/>
+          <w:color w:val="202020"/>
+          <w:sz w:val="20"/>
+          <w:szCs w:val="20"/>
+          <w:lang w:bidi="ne-NP"/>
+        </w:rPr>
+        <w:t xml:space="preserve">All changes are live on the backend and pushed to GitHub for </w:t>
+      </w:r>
+      <w:proofErr w:type="spellStart"/>
+      <w:r>
+        <w:rPr>
+          <w:rFonts w:ascii="Segoe UI" w:eastAsia="Times New Roman" w:hAnsi="Segoe UI" w:cs="Segoe UI"/>
+          <w:color w:val="202020"/>
+          <w:sz w:val="20"/>
+          <w:szCs w:val="20"/>
+          <w:lang w:bidi="ne-NP"/>
+        </w:rPr>
+        <w:t>Vercel</w:t>
+      </w:r>
+      <w:proofErr w:type="spellEnd"/>
+      <w:r>
+        <w:rPr>
+          <w:rFonts w:ascii="Segoe UI" w:eastAsia="Times New Roman" w:hAnsi="Segoe UI" w:cs="Segoe UI"/>
+          <w:color w:val="202020"/>
+          <w:sz w:val="20"/>
+          <w:szCs w:val="20"/>
+          <w:lang w:bidi="ne-NP"/>
+        </w:rPr>
+        <w:t xml:space="preserve"> to pick up.</w:t>
+      </w:r>
+    </w:p>
+    <w:p>
+      <w:pPr>
+        <w:shd w:val="clear" w:color="auto" w:fill="FAFAFD"/>
+        <w:spacing w:before="24" w:after="48" w:line="240" w:lineRule="auto"/>
+        <w:rPr>
+          <w:rFonts w:ascii="Segoe UI" w:eastAsia="Times New Roman" w:hAnsi="Segoe UI" w:cs="Segoe UI"/>
+          <w:color w:val="202020"/>
+          <w:sz w:val="20"/>
+          <w:szCs w:val="20"/>
+          <w:lang w:bidi="ne-NP"/>
+        </w:rPr>
+      </w:pPr>
+      <w:r>
+        <w:rPr>
+          <w:rFonts w:ascii="Segoe UI" w:eastAsia="Times New Roman" w:hAnsi="Segoe UI" w:cs="Segoe UI"/>
+          <w:b/>
+          <w:bCs/>
+          <w:color w:val="202020"/>
+          <w:sz w:val="24"/>
+          <w:szCs w:val="24"/>
+          <w:lang w:bidi="ne-NP"/>
+        </w:rPr>
+        <w:t>Your new admin login</w:t>
+      </w:r>
+      <w:r>
+        <w:rPr>
+          <w:rFonts w:ascii="Segoe UI" w:eastAsia="Times New Roman" w:hAnsi="Segoe UI" w:cs="Segoe UI"/>
+          <w:color w:val="202020"/>
+          <w:sz w:val="20"/>
+          <w:szCs w:val="20"/>
+          <w:lang w:bidi="ne-NP"/>
+        </w:rPr>
+        <w:t xml:space="preserve">: </w:t>
+      </w:r>
+      <w:r>
+        <w:rPr>
+          <w:rFonts w:ascii="Courier New" w:eastAsia="Times New Roman" w:hAnsi="Courier New" w:cs="Courier New"/>
+          <w:color w:val="606060"/>
+          <w:sz w:val="18"/>
+          <w:szCs w:val="18"/>
+          <w:shd w:val="clear" w:color="auto" w:fill="ECECEC"/>
+          <w:lang w:bidi="ne-NP"/>
+        </w:rPr>
+        <w:t>/admin/login</w:t>
+      </w:r>
+      <w:r>
+        <w:rPr>
+          <w:rFonts w:ascii="Segoe UI" w:eastAsia="Times New Roman" w:hAnsi="Segoe UI" w:cs="Segoe UI"/>
+          <w:color w:val="202020"/>
+          <w:sz w:val="20"/>
+          <w:szCs w:val="20"/>
+          <w:lang w:bidi="ne-NP"/>
+        </w:rPr>
+        <w:t xml:space="preserve"> → </w:t>
+      </w:r>
+      <w:r>
+        <w:rPr>
+          <w:rFonts w:ascii="Courier New" w:eastAsia="Times New Roman" w:hAnsi="Courier New" w:cs="Courier New"/>
+          <w:color w:val="606060"/>
+          <w:sz w:val="18"/>
+          <w:szCs w:val="18"/>
+          <w:shd w:val="clear" w:color="auto" w:fill="ECECEC"/>
+          <w:lang w:bidi="ne-NP"/>
+        </w:rPr>
+        <w:t>Rubalbasnet06@gmail.com</w:t>
+      </w:r>
+      <w:r>
+        <w:rPr>
+          <w:rFonts w:ascii="Segoe UI" w:eastAsia="Times New Roman" w:hAnsi="Segoe UI" w:cs="Segoe UI"/>
+          <w:color w:val="202020"/>
+          <w:sz w:val="20"/>
+          <w:szCs w:val="20"/>
+          <w:lang w:bidi="ne-NP"/>
+        </w:rPr>
+        <w:t xml:space="preserve"> / </w:t>
+      </w:r>
+      <w:r>
+        <w:rPr>
+          <w:rFonts w:ascii="Courier New" w:eastAsia="Times New Roman" w:hAnsi="Courier New" w:cs="Courier New"/>
+          <w:color w:val="606060"/>
+          <w:sz w:val="18"/>
+          <w:szCs w:val="18"/>
+          <w:shd w:val="clear" w:color="auto" w:fill="ECECEC"/>
+          <w:lang w:bidi="ne-NP"/>
+        </w:rPr>
+        <w:t>CandyStation#Rubal2026!</w:t>
+      </w:r>
+    </w:p>
+    <w:p>
+      <w:pPr>
+        <w:shd w:val="clear" w:color="auto" w:fill="FAFAFD"/>
+        <w:spacing w:before="24" w:after="48" w:line="240" w:lineRule="auto"/>
+        <w:rPr>
+          <w:rFonts w:ascii="Segoe UI" w:eastAsia="Times New Roman" w:hAnsi="Segoe UI" w:cs="Segoe UI"/>
+          <w:color w:val="202020"/>
+          <w:sz w:val="20"/>
+          <w:szCs w:val="20"/>
+          <w:lang w:bidi="ne-NP"/>
+        </w:rPr>
+      </w:pPr>
+      <w:r>
+        <w:rPr>
+          <w:rFonts w:ascii="Segoe UI" w:eastAsia="Times New Roman" w:hAnsi="Segoe UI" w:cs="Segoe UI"/>
+          <w:color w:val="202020"/>
+          <w:sz w:val="20"/>
+          <w:szCs w:val="20"/>
+          <w:lang w:bidi="ne-NP"/>
+        </w:rPr>
+        <w:t xml:space="preserve">Please check </w:t>
+      </w:r>
+      <w:r>
+        <w:rPr>
+          <w:rFonts w:ascii="Courier New" w:eastAsia="Times New Roman" w:hAnsi="Courier New" w:cs="Courier New"/>
+          <w:color w:val="606060"/>
+          <w:sz w:val="18"/>
+          <w:szCs w:val="18"/>
+          <w:shd w:val="clear" w:color="auto" w:fill="ECECEC"/>
+          <w:lang w:bidi="ne-NP"/>
+        </w:rPr>
+        <w:t>innector@gmail.com</w:t>
+      </w:r>
+      <w:r>
+        <w:rPr>
+          <w:rFonts w:ascii="Segoe UI" w:eastAsia="Times New Roman" w:hAnsi="Segoe UI" w:cs="Segoe UI"/>
+          <w:color w:val="202020"/>
+          <w:sz w:val="20"/>
+          <w:szCs w:val="20"/>
+          <w:lang w:bidi="ne-NP"/>
+        </w:rPr>
+        <w:t xml:space="preserve"> for order </w:t>
+      </w:r>
+      <w:r>
+        <w:rPr>
+          <w:rFonts w:ascii="Courier New" w:eastAsia="Times New Roman" w:hAnsi="Courier New" w:cs="Courier New"/>
+          <w:color w:val="606060"/>
+          <w:sz w:val="18"/>
+          <w:szCs w:val="18"/>
+          <w:shd w:val="clear" w:color="auto" w:fill="ECECEC"/>
+          <w:lang w:bidi="ne-NP"/>
+        </w:rPr>
+        <w:t>ORD-2026-0006</w:t>
+      </w:r>
+      <w:r>
+        <w:rPr>
+          <w:rFonts w:ascii="Segoe UI" w:eastAsia="Times New Roman" w:hAnsi="Segoe UI" w:cs="Segoe UI"/>
+          <w:color w:val="202020"/>
+          <w:sz w:val="20"/>
+          <w:szCs w:val="20"/>
+          <w:lang w:bidi="ne-NP"/>
+        </w:rPr>
+        <w:t xml:space="preserve"> and </w:t>
+      </w:r>
+      <w:r>
+        <w:rPr>
+          <w:rFonts w:ascii="Courier New" w:eastAsia="Times New Roman" w:hAnsi="Courier New" w:cs="Courier New"/>
+          <w:color w:val="606060"/>
+          <w:sz w:val="18"/>
+          <w:szCs w:val="18"/>
+          <w:shd w:val="clear" w:color="auto" w:fill="ECECEC"/>
+          <w:lang w:bidi="ne-NP"/>
+        </w:rPr>
+        <w:t>Rubalbasnet06@gmail.com</w:t>
+      </w:r>
+      <w:r>
+        <w:rPr>
+          <w:rFonts w:ascii="Segoe UI" w:eastAsia="Times New Roman" w:hAnsi="Segoe UI" w:cs="Segoe UI"/>
+          <w:color w:val="202020"/>
+          <w:sz w:val="20"/>
+          <w:szCs w:val="20"/>
+          <w:lang w:bidi="ne-NP"/>
+        </w:rPr>
+        <w:t xml:space="preserve"> for the admin notification to confirm real delivery now that the SMTP key is fixed.</w:t>
+      </w:r>
+    </w:p>
     <w:p/>
     <w:p/>
     <w:p>
       <w:r>
         <w:t>xsmtpsib-5a51d49d35793a2b6bdfa59c78f9ef5a4967248108deb0c8fc4266a5d4c78e7a-eHynu202iReqM7vb</w:t>
+      </w:r>
+    </w:p>
+    <w:p/>
+    <w:p/>
+    <w:p/>
+    <w:p>
+      <w:r>
+        <w:t>xsmtpsib-5a51d49d35793a2b6bdfa59c78f9ef5a4967248108deb0c8fc4266a5d4c78e7a-AFmZsoWBngcPL8pB</w:t>
       </w:r>
     </w:p>
     <w:p/>
@@ -2047,14 +3045,10 @@
           <w:szCs w:val="20"/>
           <w:lang w:bidi="ne-NP"/>
         </w:rPr>
-        <w:lastRenderedPageBreak/>
         <w:t>Once that's redeployed, tell me and I'll re-check the bundle to confirm it's pointing at the real backend, then do a full live test — browsing, cart, checkout, login — end to end.</w:t>
       </w:r>
     </w:p>
-    <w:p>
-      <w:bookmarkStart w:id="0" w:name="_GoBack"/>
-      <w:bookmarkEnd w:id="0"/>
-    </w:p>
+    <w:p/>
     <w:sectPr>
       <w:pgSz w:w="12240" w:h="15840"/>
       <w:pgMar w:top="1440" w:right="1440" w:bottom="1440" w:left="1440" w:header="720" w:footer="720" w:gutter="0"/>
@@ -2068,6 +3062,119 @@
 <file path=word/numbering.xml><?xml version="1.0" encoding="utf-8"?>
 <w:numbering xmlns:wpc="http://schemas.microsoft.com/office/word/2010/wordprocessingCanvas" xmlns:cx="http://schemas.microsoft.com/office/drawing/2014/chartex" xmlns:cx1="http://schemas.microsoft.com/office/drawing/2015/9/8/chartex" xmlns:cx2="http://schemas.microsoft.com/office/drawing/2015/10/21/chartex" xmlns:cx3="http://schemas.microsoft.com/office/drawing/2016/5/9/chartex" xmlns:cx4="http://schemas.microsoft.com/office/drawing/2016/5/10/chartex" xmlns:cx5="http://schemas.microsoft.com/office/drawing/2016/5/11/chartex" xmlns:cx6="http://schemas.microsoft.com/office/drawing/2016/5/12/chartex" xmlns:cx7="http://schemas.microsoft.com/office/drawing/2016/5/13/chartex" xmlns:cx8="http://schemas.microsoft.com/office/drawing/2016/5/14/chartex" xmlns:mc="http://schemas.openxmlformats.org/markup-compatibility/2006" xmlns:aink="http://schemas.microsoft.com/office/drawing/2016/ink" xmlns:am3d="http://schemas.microsoft.com/office/drawing/2017/model3d" xmlns:o="urn:schemas-microsoft-com:office:office" xmlns:r="http://schemas.openxmlformats.org/officeDocument/2006/relationships" xmlns:m="http://schemas.openxmlformats.org/officeDocument/2006/math" xmlns:v="urn:schemas-microsoft-com:vml" xmlns:wp14="http://schemas.microsoft.com/office/word/2010/wordprocessingDrawing" xmlns:wp="http://schemas.openxmlformats.org/drawingml/2006/wordprocessingDrawing" xmlns:w10="urn:schemas-microsoft-com:office:word" xmlns:w="http://schemas.openxmlformats.org/wordprocessingml/2006/main" xmlns:w14="http://schemas.microsoft.com/office/word/2010/wordml" xmlns:w15="http://schemas.microsoft.com/office/word/2012/wordml" xmlns:w16cid="http://schemas.microsoft.com/office/word/2016/wordml/cid" xmlns:w16se="http://schemas.microsoft.com/office/word/2015/wordml/symex" xmlns:wpg="http://schemas.microsoft.com/office/word/2010/wordprocessingGroup" xmlns:wpi="http://schemas.microsoft.com/office/word/2010/wordprocessingInk" xmlns:wne="http://schemas.microsoft.com/office/word/2006/wordml" xmlns:wps="http://schemas.microsoft.com/office/word/2010/wordprocessingShape" mc:Ignorable="w14 w15 w16se w16cid wp14">
   <w:abstractNum w:abstractNumId="0" w15:restartNumberingAfterBreak="0">
+    <w:nsid w:val="14B04BE7"/>
+    <w:multiLevelType w:val="multilevel"/>
+    <w:tmpl w:val="4A864E1E"/>
+    <w:lvl w:ilvl="0">
+      <w:start w:val="1"/>
+      <w:numFmt w:val="decimal"/>
+      <w:lvlText w:val="%1."/>
+      <w:lvlJc w:val="left"/>
+      <w:pPr>
+        <w:tabs>
+          <w:tab w:val="num" w:pos="720"/>
+        </w:tabs>
+        <w:ind w:left="720" w:hanging="360"/>
+      </w:pPr>
+    </w:lvl>
+    <w:lvl w:ilvl="1" w:tentative="1">
+      <w:start w:val="1"/>
+      <w:numFmt w:val="decimal"/>
+      <w:lvlText w:val="%2."/>
+      <w:lvlJc w:val="left"/>
+      <w:pPr>
+        <w:tabs>
+          <w:tab w:val="num" w:pos="1440"/>
+        </w:tabs>
+        <w:ind w:left="1440" w:hanging="360"/>
+      </w:pPr>
+    </w:lvl>
+    <w:lvl w:ilvl="2" w:tentative="1">
+      <w:start w:val="1"/>
+      <w:numFmt w:val="decimal"/>
+      <w:lvlText w:val="%3."/>
+      <w:lvlJc w:val="left"/>
+      <w:pPr>
+        <w:tabs>
+          <w:tab w:val="num" w:pos="2160"/>
+        </w:tabs>
+        <w:ind w:left="2160" w:hanging="360"/>
+      </w:pPr>
+    </w:lvl>
+    <w:lvl w:ilvl="3" w:tentative="1">
+      <w:start w:val="1"/>
+      <w:numFmt w:val="decimal"/>
+      <w:lvlText w:val="%4."/>
+      <w:lvlJc w:val="left"/>
+      <w:pPr>
+        <w:tabs>
+          <w:tab w:val="num" w:pos="2880"/>
+        </w:tabs>
+        <w:ind w:left="2880" w:hanging="360"/>
+      </w:pPr>
+    </w:lvl>
+    <w:lvl w:ilvl="4" w:tentative="1">
+      <w:start w:val="1"/>
+      <w:numFmt w:val="decimal"/>
+      <w:lvlText w:val="%5."/>
+      <w:lvlJc w:val="left"/>
+      <w:pPr>
+        <w:tabs>
+          <w:tab w:val="num" w:pos="3600"/>
+        </w:tabs>
+        <w:ind w:left="3600" w:hanging="360"/>
+      </w:pPr>
+    </w:lvl>
+    <w:lvl w:ilvl="5" w:tentative="1">
+      <w:start w:val="1"/>
+      <w:numFmt w:val="decimal"/>
+      <w:lvlText w:val="%6."/>
+      <w:lvlJc w:val="left"/>
+      <w:pPr>
+        <w:tabs>
+          <w:tab w:val="num" w:pos="4320"/>
+        </w:tabs>
+        <w:ind w:left="4320" w:hanging="360"/>
+      </w:pPr>
+    </w:lvl>
+    <w:lvl w:ilvl="6" w:tentative="1">
+      <w:start w:val="1"/>
+      <w:numFmt w:val="decimal"/>
+      <w:lvlText w:val="%7."/>
+      <w:lvlJc w:val="left"/>
+      <w:pPr>
+        <w:tabs>
+          <w:tab w:val="num" w:pos="5040"/>
+        </w:tabs>
+        <w:ind w:left="5040" w:hanging="360"/>
+      </w:pPr>
+    </w:lvl>
+    <w:lvl w:ilvl="7" w:tentative="1">
+      <w:start w:val="1"/>
+      <w:numFmt w:val="decimal"/>
+      <w:lvlText w:val="%8."/>
+      <w:lvlJc w:val="left"/>
+      <w:pPr>
+        <w:tabs>
+          <w:tab w:val="num" w:pos="5760"/>
+        </w:tabs>
+        <w:ind w:left="5760" w:hanging="360"/>
+      </w:pPr>
+    </w:lvl>
+    <w:lvl w:ilvl="8" w:tentative="1">
+      <w:start w:val="1"/>
+      <w:numFmt w:val="decimal"/>
+      <w:lvlText w:val="%9."/>
+      <w:lvlJc w:val="left"/>
+      <w:pPr>
+        <w:tabs>
+          <w:tab w:val="num" w:pos="6480"/>
+        </w:tabs>
+        <w:ind w:left="6480" w:hanging="360"/>
+      </w:pPr>
+    </w:lvl>
+  </w:abstractNum>
+  <w:abstractNum w:abstractNumId="1" w15:restartNumberingAfterBreak="0">
     <w:nsid w:val="151041E9"/>
     <w:multiLevelType w:val="multilevel"/>
     <w:tmpl w:val="9FEA71BA"/>
@@ -2181,6 +3288,9 @@
     </w:lvl>
   </w:abstractNum>
   <w:num w:numId="1">
+    <w:abstractNumId w:val="1"/>
+  </w:num>
+  <w:num w:numId="2">
     <w:abstractNumId w:val="0"/>
   </w:num>
 </w:numbering>
@@ -2693,12 +3803,23 @@
     <w:name w:val="Hyperlink"/>
     <w:basedOn w:val="DefaultParagraphFont"/>
     <w:uiPriority w:val="99"/>
-    <w:semiHidden/>
     <w:unhideWhenUsed/>
     <w:rsid w:val="00934017"/>
     <w:rPr>
       <w:color w:val="0000FF"/>
       <w:u w:val="single"/>
+    </w:rPr>
+  </w:style>
+  <w:style w:type="character" w:styleId="UnresolvedMention">
+    <w:name w:val="Unresolved Mention"/>
+    <w:basedOn w:val="DefaultParagraphFont"/>
+    <w:uiPriority w:val="99"/>
+    <w:semiHidden/>
+    <w:unhideWhenUsed/>
+    <w:rsid w:val="008850D2"/>
+    <w:rPr>
+      <w:color w:val="605E5C"/>
+      <w:shd w:val="clear" w:color="auto" w:fill="E1DFDD"/>
     </w:rPr>
   </w:style>
 </w:styles>
@@ -3233,15 +4354,15 @@
 <file path=customXml/itemProps3.xml><?xml version="1.0" encoding="utf-8"?>
 <ds:datastoreItem xmlns:ds="http://schemas.openxmlformats.org/officeDocument/2006/customXml" ds:itemID="{2C976FAB-2B93-4B2E-B808-24A9AAA7AA1D}">
   <ds:schemaRefs>
+    <ds:schemaRef ds:uri="http://www.w3.org/XML/1998/namespace"/>
+    <ds:schemaRef ds:uri="http://purl.org/dc/dcmitype/"/>
+    <ds:schemaRef ds:uri="http://purl.org/dc/elements/1.1/"/>
+    <ds:schemaRef ds:uri="http://schemas.microsoft.com/office/2006/documentManagement/types"/>
+    <ds:schemaRef ds:uri="a6671aee-fab8-4be1-a1d0-905671655391"/>
+    <ds:schemaRef ds:uri="http://purl.org/dc/terms/"/>
+    <ds:schemaRef ds:uri="http://schemas.microsoft.com/office/2006/metadata/properties"/>
     <ds:schemaRef ds:uri="http://schemas.microsoft.com/office/infopath/2007/PartnerControls"/>
-    <ds:schemaRef ds:uri="http://purl.org/dc/elements/1.1/"/>
-    <ds:schemaRef ds:uri="http://www.w3.org/XML/1998/namespace"/>
-    <ds:schemaRef ds:uri="http://schemas.microsoft.com/office/2006/metadata/properties"/>
-    <ds:schemaRef ds:uri="http://purl.org/dc/terms/"/>
-    <ds:schemaRef ds:uri="http://schemas.microsoft.com/office/2006/documentManagement/types"/>
     <ds:schemaRef ds:uri="http://schemas.openxmlformats.org/package/2006/metadata/core-properties"/>
-    <ds:schemaRef ds:uri="a6671aee-fab8-4be1-a1d0-905671655391"/>
-    <ds:schemaRef ds:uri="http://purl.org/dc/dcmitype/"/>
   </ds:schemaRefs>
 </ds:datastoreItem>
 </file>
</xml_diff>